<commit_message>
Update Word templates with latest versions
</commit_message>
<xml_diff>
--- a/release/templates/مکانیک مرحله اول.docx
+++ b/release/templates/مکانیک مرحله اول.docx
@@ -2092,7 +2092,7 @@
             <w14:round/>
           </w14:textOutline>
         </w:rPr>
-        <w:t xml:space="preserve"> مالک «مالک»، مهندس ناظر محمد مهد</w:t>
+        <w:t xml:space="preserve"> مالک «مالک»، مهندس ناظر</w:t>
       </w:r>
       <w:r>
         <w:rPr>
@@ -2113,7 +2113,7 @@
             <w14:round/>
           </w14:textOutline>
         </w:rPr>
-        <w:t>ی</w:t>
+        <w:t>"اسم ناظر جایگزین شود"</w:t>
       </w:r>
       <w:r>
         <w:rPr>
@@ -2134,28 +2134,7 @@
             <w14:round/>
           </w14:textOutline>
         </w:rPr>
-        <w:t xml:space="preserve"> برخوردار</w:t>
-      </w:r>
-      <w:r>
-        <w:rPr>
-          <w:rFonts w:cs="B Nazanin" w:hint="cs"/>
-          <w:color w:val="000000" w:themeColor="text1"/>
-          <w:sz w:val="26"/>
-          <w:szCs w:val="26"/>
-          <w:rtl/>
-          <w:lang w:bidi="fa-IR"/>
-          <w14:shadow w14:blurRad="38100" w14:dist="19050" w14:dir="2700000" w14:sx="100000" w14:sy="100000" w14:kx="0" w14:ky="0" w14:algn="tl">
-            <w14:schemeClr w14:val="dk1">
-              <w14:alpha w14:val="60000"/>
-            </w14:schemeClr>
-          </w14:shadow>
-          <w14:textOutline w14:w="0" w14:cap="flat" w14:cmpd="sng" w14:algn="ctr">
-            <w14:noFill/>
-            <w14:prstDash w14:val="solid"/>
-            <w14:round/>
-          </w14:textOutline>
-        </w:rPr>
-        <w:t>ی</w:t>
+        <w:t xml:space="preserve"> </w:t>
       </w:r>
       <w:r>
         <w:rPr>

</xml_diff>